<commit_message>
Re-do SisterAct_Reflection answers in regular Arial text
Replace the handwritten-image answers with plain typed Arial 11pt text
under each question. Same 1-2 sentence basic-level answers.

https://claude.ai/code/session_01UGKXnC4zbQUkz9dZStT3GB
</commit_message>
<xml_diff>
--- a/SisterAct_Reflection.docx
+++ b/SisterAct_Reflection.docx
@@ -201,38 +201,11 @@
         <w:t xml:space="preserve"/>
       </w:r>
       <w:r>
-        <w:drawing>
-          <wp:inline xmlns:a="http://schemas.openxmlformats.org/drawingml/2006/main" xmlns:pic="http://schemas.openxmlformats.org/drawingml/2006/picture">
-            <wp:extent cx="5303520" cy="455014"/>
-            <wp:docPr id="1" name="Picture 1"/>
-            <wp:cNvGraphicFramePr>
-              <a:graphicFrameLocks noChangeAspect="1"/>
-            </wp:cNvGraphicFramePr>
-            <a:graphic>
-              <a:graphicData uri="http://schemas.openxmlformats.org/drawingml/2006/picture">
-                <pic:pic>
-                  <pic:nvPicPr>
-                    <pic:cNvPr id="0" name="q1.png"/>
-                    <pic:cNvPicPr/>
-                  </pic:nvPicPr>
-                  <pic:blipFill>
-                    <a:blip r:embed="rId8"/>
-                    <a:stretch>
-                      <a:fillRect/>
-                    </a:stretch>
-                  </pic:blipFill>
-                  <pic:spPr>
-                    <a:xfrm>
-                      <a:off x="0" y="0"/>
-                      <a:ext cx="5303520" cy="455014"/>
-                    </a:xfrm>
-                    <a:prstGeom prst="rect"/>
-                  </pic:spPr>
-                </pic:pic>
-              </a:graphicData>
-            </a:graphic>
-          </wp:inline>
-        </w:drawing>
+        <w:rPr>
+          <w:rFonts w:ascii="Arial" w:hAnsi="Arial" w:cs="Arial" w:eastAsia="Arial"/>
+          <w:sz w:val="22"/>
+        </w:rPr>
+        <w:t>Catholic (universal). The choir scene shows all kinds of people from the neighborhood coming into the church.</w:t>
       </w:r>
     </w:p>
     <w:p>
@@ -324,38 +297,11 @@
         <w:t xml:space="preserve"/>
       </w:r>
       <w:r>
-        <w:drawing>
-          <wp:inline xmlns:a="http://schemas.openxmlformats.org/drawingml/2006/main" xmlns:pic="http://schemas.openxmlformats.org/drawingml/2006/picture">
-            <wp:extent cx="5303520" cy="481454"/>
-            <wp:docPr id="2" name="Picture 2"/>
-            <wp:cNvGraphicFramePr>
-              <a:graphicFrameLocks noChangeAspect="1"/>
-            </wp:cNvGraphicFramePr>
-            <a:graphic>
-              <a:graphicData uri="http://schemas.openxmlformats.org/drawingml/2006/picture">
-                <pic:pic>
-                  <pic:nvPicPr>
-                    <pic:cNvPr id="0" name="q2.png"/>
-                    <pic:cNvPicPr/>
-                  </pic:nvPicPr>
-                  <pic:blipFill>
-                    <a:blip r:embed="rId9"/>
-                    <a:stretch>
-                      <a:fillRect/>
-                    </a:stretch>
-                  </pic:blipFill>
-                  <pic:spPr>
-                    <a:xfrm>
-                      <a:off x="0" y="0"/>
-                      <a:ext cx="5303520" cy="481454"/>
-                    </a:xfrm>
-                    <a:prstGeom prst="rect"/>
-                  </pic:spPr>
-                </pic:pic>
-              </a:graphicData>
-            </a:graphic>
-          </wp:inline>
-        </w:drawing>
+        <w:rPr>
+          <w:rFonts w:ascii="Arial" w:hAnsi="Arial" w:cs="Arial" w:eastAsia="Arial"/>
+          <w:sz w:val="22"/>
+        </w:rPr>
+        <w:t>Catholic is missing. The church starts empty and closed off. By the end the place is packed with people.</w:t>
       </w:r>
     </w:p>
     <w:p>
@@ -447,38 +393,11 @@
         <w:t xml:space="preserve"/>
       </w:r>
       <w:r>
-        <w:drawing>
-          <wp:inline xmlns:a="http://schemas.openxmlformats.org/drawingml/2006/main" xmlns:pic="http://schemas.openxmlformats.org/drawingml/2006/picture">
-            <wp:extent cx="5303520" cy="478629"/>
-            <wp:docPr id="3" name="Picture 3"/>
-            <wp:cNvGraphicFramePr>
-              <a:graphicFrameLocks noChangeAspect="1"/>
-            </wp:cNvGraphicFramePr>
-            <a:graphic>
-              <a:graphicData uri="http://schemas.openxmlformats.org/drawingml/2006/picture">
-                <pic:pic>
-                  <pic:nvPicPr>
-                    <pic:cNvPr id="0" name="q3.png"/>
-                    <pic:cNvPicPr/>
-                  </pic:nvPicPr>
-                  <pic:blipFill>
-                    <a:blip r:embed="rId10"/>
-                    <a:stretch>
-                      <a:fillRect/>
-                    </a:stretch>
-                  </pic:blipFill>
-                  <pic:spPr>
-                    <a:xfrm>
-                      <a:off x="0" y="0"/>
-                      <a:ext cx="5303520" cy="478629"/>
-                    </a:xfrm>
-                    <a:prstGeom prst="rect"/>
-                  </pic:spPr>
-                </pic:pic>
-              </a:graphicData>
-            </a:graphic>
-          </wp:inline>
-        </w:drawing>
+        <w:rPr>
+          <w:rFonts w:ascii="Arial" w:hAnsi="Arial" w:cs="Arial" w:eastAsia="Arial"/>
+          <w:sz w:val="22"/>
+        </w:rPr>
+        <w:t>The nuns leave the church to clean up the streets. They paint over graffiti and meet people in the neighborhood.</w:t>
       </w:r>
     </w:p>
     <w:p>
@@ -597,38 +516,11 @@
         <w:t xml:space="preserve"/>
       </w:r>
       <w:r>
-        <w:drawing>
-          <wp:inline xmlns:a="http://schemas.openxmlformats.org/drawingml/2006/main" xmlns:pic="http://schemas.openxmlformats.org/drawingml/2006/picture">
-            <wp:extent cx="5303520" cy="472975"/>
-            <wp:docPr id="4" name="Picture 4"/>
-            <wp:cNvGraphicFramePr>
-              <a:graphicFrameLocks noChangeAspect="1"/>
-            </wp:cNvGraphicFramePr>
-            <a:graphic>
-              <a:graphicData uri="http://schemas.openxmlformats.org/drawingml/2006/picture">
-                <pic:pic>
-                  <pic:nvPicPr>
-                    <pic:cNvPr id="0" name="q4.png"/>
-                    <pic:cNvPicPr/>
-                  </pic:nvPicPr>
-                  <pic:blipFill>
-                    <a:blip r:embed="rId11"/>
-                    <a:stretch>
-                      <a:fillRect/>
-                    </a:stretch>
-                  </pic:blipFill>
-                  <pic:spPr>
-                    <a:xfrm>
-                      <a:off x="0" y="0"/>
-                      <a:ext cx="5303520" cy="472975"/>
-                    </a:xfrm>
-                    <a:prstGeom prst="rect"/>
-                  </pic:spPr>
-                </pic:pic>
-              </a:graphicData>
-            </a:graphic>
-          </wp:inline>
-        </w:drawing>
+        <w:rPr>
+          <w:rFonts w:ascii="Arial" w:hAnsi="Arial" w:cs="Arial" w:eastAsia="Arial"/>
+          <w:sz w:val="22"/>
+        </w:rPr>
+        <w:t>She fixes the choir and people start coming back to church. Your vocation can find you even when you are not looking for it.</w:t>
       </w:r>
     </w:p>
     <w:p>
@@ -720,38 +612,11 @@
         <w:t xml:space="preserve"/>
       </w:r>
       <w:r>
-        <w:drawing>
-          <wp:inline xmlns:a="http://schemas.openxmlformats.org/drawingml/2006/main" xmlns:pic="http://schemas.openxmlformats.org/drawingml/2006/picture">
-            <wp:extent cx="5029200" cy="665935"/>
-            <wp:docPr id="5" name="Picture 5"/>
-            <wp:cNvGraphicFramePr>
-              <a:graphicFrameLocks noChangeAspect="1"/>
-            </wp:cNvGraphicFramePr>
-            <a:graphic>
-              <a:graphicData uri="http://schemas.openxmlformats.org/drawingml/2006/picture">
-                <pic:pic>
-                  <pic:nvPicPr>
-                    <pic:cNvPr id="0" name="q5.png"/>
-                    <pic:cNvPicPr/>
-                  </pic:nvPicPr>
-                  <pic:blipFill>
-                    <a:blip r:embed="rId12"/>
-                    <a:stretch>
-                      <a:fillRect/>
-                    </a:stretch>
-                  </pic:blipFill>
-                  <pic:spPr>
-                    <a:xfrm>
-                      <a:off x="0" y="0"/>
-                      <a:ext cx="5029200" cy="665935"/>
-                    </a:xfrm>
-                    <a:prstGeom prst="rect"/>
-                  </pic:spPr>
-                </pic:pic>
-              </a:graphicData>
-            </a:graphic>
-          </wp:inline>
-        </w:drawing>
+        <w:rPr>
+          <w:rFonts w:ascii="Arial" w:hAnsi="Arial" w:cs="Arial" w:eastAsia="Arial"/>
+          <w:sz w:val="22"/>
+        </w:rPr>
+        <w:t>Sister Mary Robert has a great voice and helps the choir sing. Sister Mary Patrick is full of joy and makes people feel welcome.</w:t>
       </w:r>
     </w:p>
     <w:p>
@@ -843,38 +708,11 @@
         <w:t xml:space="preserve"/>
       </w:r>
       <w:r>
-        <w:drawing>
-          <wp:inline xmlns:a="http://schemas.openxmlformats.org/drawingml/2006/main" xmlns:pic="http://schemas.openxmlformats.org/drawingml/2006/picture">
-            <wp:extent cx="5303520" cy="458236"/>
-            <wp:docPr id="6" name="Picture 6"/>
-            <wp:cNvGraphicFramePr>
-              <a:graphicFrameLocks noChangeAspect="1"/>
-            </wp:cNvGraphicFramePr>
-            <a:graphic>
-              <a:graphicData uri="http://schemas.openxmlformats.org/drawingml/2006/picture">
-                <pic:pic>
-                  <pic:nvPicPr>
-                    <pic:cNvPr id="0" name="q6.png"/>
-                    <pic:cNvPicPr/>
-                  </pic:nvPicPr>
-                  <pic:blipFill>
-                    <a:blip r:embed="rId13"/>
-                    <a:stretch>
-                      <a:fillRect/>
-                    </a:stretch>
-                  </pic:blipFill>
-                  <pic:spPr>
-                    <a:xfrm>
-                      <a:off x="0" y="0"/>
-                      <a:ext cx="5303520" cy="458236"/>
-                    </a:xfrm>
-                    <a:prstGeom prst="rect"/>
-                  </pic:spPr>
-                </pic:pic>
-              </a:graphicData>
-            </a:graphic>
-          </wp:inline>
-        </w:drawing>
+        <w:rPr>
+          <w:rFonts w:ascii="Arial" w:hAnsi="Arial" w:cs="Arial" w:eastAsia="Arial"/>
+          <w:sz w:val="22"/>
+        </w:rPr>
+        <w:t>The nuns sound bad when they sing stiff and proper. When they sing their real way, people actually come listen.</w:t>
       </w:r>
     </w:p>
     <w:p>
@@ -1009,38 +847,11 @@
         <w:t xml:space="preserve"/>
       </w:r>
       <w:r>
-        <w:drawing>
-          <wp:inline xmlns:a="http://schemas.openxmlformats.org/drawingml/2006/main" xmlns:pic="http://schemas.openxmlformats.org/drawingml/2006/picture">
-            <wp:extent cx="5303520" cy="481421"/>
-            <wp:docPr id="7" name="Picture 7"/>
-            <wp:cNvGraphicFramePr>
-              <a:graphicFrameLocks noChangeAspect="1"/>
-            </wp:cNvGraphicFramePr>
-            <a:graphic>
-              <a:graphicData uri="http://schemas.openxmlformats.org/drawingml/2006/picture">
-                <pic:pic>
-                  <pic:nvPicPr>
-                    <pic:cNvPr id="0" name="q7.png"/>
-                    <pic:cNvPicPr/>
-                  </pic:nvPicPr>
-                  <pic:blipFill>
-                    <a:blip r:embed="rId14"/>
-                    <a:stretch>
-                      <a:fillRect/>
-                    </a:stretch>
-                  </pic:blipFill>
-                  <pic:spPr>
-                    <a:xfrm>
-                      <a:off x="0" y="0"/>
-                      <a:ext cx="5303520" cy="481421"/>
-                    </a:xfrm>
-                    <a:prstGeom prst="rect"/>
-                  </pic:spPr>
-                </pic:pic>
-              </a:graphicData>
-            </a:graphic>
-          </wp:inline>
-        </w:drawing>
+        <w:rPr>
+          <w:rFonts w:ascii="Arial" w:hAnsi="Arial" w:cs="Arial" w:eastAsia="Arial"/>
+          <w:sz w:val="22"/>
+        </w:rPr>
+        <w:t>When the nuns helped people in the streets and prayed with them. It felt real because they really cared.</w:t>
       </w:r>
     </w:p>
     <w:p>
@@ -1116,38 +927,11 @@
         <w:t xml:space="preserve"/>
       </w:r>
       <w:r>
-        <w:drawing>
-          <wp:inline xmlns:a="http://schemas.openxmlformats.org/drawingml/2006/main" xmlns:pic="http://schemas.openxmlformats.org/drawingml/2006/picture">
-            <wp:extent cx="5303520" cy="437404"/>
-            <wp:docPr id="8" name="Picture 8"/>
-            <wp:cNvGraphicFramePr>
-              <a:graphicFrameLocks noChangeAspect="1"/>
-            </wp:cNvGraphicFramePr>
-            <a:graphic>
-              <a:graphicData uri="http://schemas.openxmlformats.org/drawingml/2006/picture">
-                <pic:pic>
-                  <pic:nvPicPr>
-                    <pic:cNvPr id="0" name="q8.png"/>
-                    <pic:cNvPicPr/>
-                  </pic:nvPicPr>
-                  <pic:blipFill>
-                    <a:blip r:embed="rId15"/>
-                    <a:stretch>
-                      <a:fillRect/>
-                    </a:stretch>
-                  </pic:blipFill>
-                  <pic:spPr>
-                    <a:xfrm>
-                      <a:off x="0" y="0"/>
-                      <a:ext cx="5303520" cy="437404"/>
-                    </a:xfrm>
-                    <a:prstGeom prst="rect"/>
-                  </pic:spPr>
-                </pic:pic>
-              </a:graphicData>
-            </a:graphic>
-          </wp:inline>
-        </w:drawing>
+        <w:rPr>
+          <w:rFonts w:ascii="Arial" w:hAnsi="Arial" w:cs="Arial" w:eastAsia="Arial"/>
+          <w:sz w:val="22"/>
+        </w:rPr>
+        <w:t>Anyone can minister, not just perfect people. God uses regular people too.</w:t>
       </w:r>
     </w:p>
     <w:p>
@@ -1239,38 +1023,11 @@
         <w:t xml:space="preserve"/>
       </w:r>
       <w:r>
-        <w:drawing>
-          <wp:inline xmlns:a="http://schemas.openxmlformats.org/drawingml/2006/main" xmlns:pic="http://schemas.openxmlformats.org/drawingml/2006/picture">
-            <wp:extent cx="5303520" cy="484202"/>
-            <wp:docPr id="9" name="Picture 9"/>
-            <wp:cNvGraphicFramePr>
-              <a:graphicFrameLocks noChangeAspect="1"/>
-            </wp:cNvGraphicFramePr>
-            <a:graphic>
-              <a:graphicData uri="http://schemas.openxmlformats.org/drawingml/2006/picture">
-                <pic:pic>
-                  <pic:nvPicPr>
-                    <pic:cNvPr id="0" name="q9.png"/>
-                    <pic:cNvPicPr/>
-                  </pic:nvPicPr>
-                  <pic:blipFill>
-                    <a:blip r:embed="rId16"/>
-                    <a:stretch>
-                      <a:fillRect/>
-                    </a:stretch>
-                  </pic:blipFill>
-                  <pic:spPr>
-                    <a:xfrm>
-                      <a:off x="0" y="0"/>
-                      <a:ext cx="5303520" cy="484202"/>
-                    </a:xfrm>
-                    <a:prstGeom prst="rect"/>
-                  </pic:spPr>
-                </pic:pic>
-              </a:graphicData>
-            </a:graphic>
-          </wp:inline>
-        </w:drawing>
+        <w:rPr>
+          <w:rFonts w:ascii="Arial" w:hAnsi="Arial" w:cs="Arial" w:eastAsia="Arial"/>
+          <w:sz w:val="22"/>
+        </w:rPr>
+        <w:t>I am a good listener. I can help friends feel heard when they are going through hard stuff.</w:t>
       </w:r>
     </w:p>
     <w:p>

</xml_diff>